<commit_message>
improvization generate Individual Klaim
Individual v2
</commit_message>
<xml_diff>
--- a/public/doc/klaim/billing/cetakBerkasBilling.docx
+++ b/public/doc/klaim/billing/cetakBerkasBilling.docx
@@ -1790,7 +1790,7 @@
                 </mc:Choice>
                 <mc:Fallback>
                   <w:pict>
-                    <v:line w14:anchorId="26D8934B" id="Straight Connector 4" o:spid="_x0000_s1026" style="position:absolute;z-index:251665408;visibility:visible;mso-wrap-style:square;mso-width-percent:0;mso-height-percent:0;mso-wrap-distance-left:9pt;mso-wrap-distance-top:0;mso-wrap-distance-right:9pt;mso-wrap-distance-bottom:0;mso-position-horizontal:absolute;mso-position-horizontal-relative:text;mso-position-vertical:absolute;mso-position-vertical-relative:text;mso-width-percent:0;mso-height-percent:0;mso-width-relative:margin;mso-height-relative:margin" from="-1.1pt,-.7pt" to="556.75pt,-.7pt" o:gfxdata="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" strokecolor="#272727 [2749]">
+                    <v:line w14:anchorId="4F93915E" id="Straight Connector 4" o:spid="_x0000_s1026" style="position:absolute;z-index:251665408;visibility:visible;mso-wrap-style:square;mso-width-percent:0;mso-height-percent:0;mso-wrap-distance-left:9pt;mso-wrap-distance-top:0;mso-wrap-distance-right:9pt;mso-wrap-distance-bottom:0;mso-position-horizontal:absolute;mso-position-horizontal-relative:text;mso-position-vertical:absolute;mso-position-vertical-relative:text;mso-width-percent:0;mso-height-percent:0;mso-width-relative:margin;mso-height-relative:margin" from="-1.1pt,-.7pt" to="556.75pt,-.7pt" o:gfxdata="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" strokecolor="#272727 [2749]">
                       <v:stroke dashstyle="dash"/>
                     </v:line>
                   </w:pict>
@@ -1871,7 +1871,7 @@
                 </mc:Choice>
                 <mc:Fallback>
                   <w:pict>
-                    <v:line w14:anchorId="0113F79D" id="Straight Connector 3" o:spid="_x0000_s1026" style="position:absolute;z-index:251655168;visibility:visible;mso-wrap-style:square;mso-width-percent:0;mso-height-percent:0;mso-wrap-distance-left:9pt;mso-wrap-distance-top:0;mso-wrap-distance-right:9pt;mso-wrap-distance-bottom:0;mso-position-horizontal:absolute;mso-position-horizontal-relative:text;mso-position-vertical:absolute;mso-position-vertical-relative:text;mso-width-percent:0;mso-height-percent:0;mso-width-relative:margin;mso-height-relative:margin" from="-1.65pt,16.9pt" to="556.2pt,16.9pt" o:gfxdata="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" strokecolor="#272727 [2749]">
+                    <v:line w14:anchorId="2A81FC53" id="Straight Connector 3" o:spid="_x0000_s1026" style="position:absolute;z-index:251655168;visibility:visible;mso-wrap-style:square;mso-width-percent:0;mso-height-percent:0;mso-wrap-distance-left:9pt;mso-wrap-distance-top:0;mso-wrap-distance-right:9pt;mso-wrap-distance-bottom:0;mso-position-horizontal:absolute;mso-position-horizontal-relative:text;mso-position-vertical:absolute;mso-position-vertical-relative:text;mso-width-percent:0;mso-height-percent:0;mso-width-relative:margin;mso-height-relative:margin" from="-1.65pt,16.9pt" to="556.2pt,16.9pt" o:gfxdata="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" strokecolor="#272727 [2749]">
                       <v:stroke dashstyle="dash"/>
                     </v:line>
                   </w:pict>
@@ -2551,6 +2551,8 @@
           </w:tcPr>
           <w:p>
             <w:pPr>
+              <w:keepNext/>
+              <w:keepLines/>
               <w:jc w:val="right"/>
             </w:pPr>
             <w:r>
@@ -2627,7 +2629,7 @@
                 </mc:Choice>
                 <mc:Fallback>
                   <w:pict>
-                    <v:line w14:anchorId="15D83FA1" id="Straight Connector 2" o:spid="_x0000_s1026" style="position:absolute;z-index:251645952;visibility:visible;mso-wrap-style:square;mso-width-percent:0;mso-height-percent:0;mso-wrap-distance-left:9pt;mso-wrap-distance-top:0;mso-wrap-distance-right:9pt;mso-wrap-distance-bottom:0;mso-position-horizontal:absolute;mso-position-horizontal-relative:text;mso-position-vertical:absolute;mso-position-vertical-relative:text;mso-width-percent:0;mso-height-percent:0;mso-width-relative:margin;mso-height-relative:margin" from=".1pt,.2pt" to="557.95pt,.2pt" o:gfxdata="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" strokecolor="#272727 [2749]">
+                    <v:line w14:anchorId="49F0D821" id="Straight Connector 2" o:spid="_x0000_s1026" style="position:absolute;z-index:251645952;visibility:visible;mso-wrap-style:square;mso-width-percent:0;mso-height-percent:0;mso-wrap-distance-left:9pt;mso-wrap-distance-top:0;mso-wrap-distance-right:9pt;mso-wrap-distance-bottom:0;mso-position-horizontal:absolute;mso-position-horizontal-relative:text;mso-position-vertical:absolute;mso-position-vertical-relative:text;mso-width-percent:0;mso-height-percent:0;mso-width-relative:margin;mso-height-relative:margin" from=".1pt,.2pt" to="557.95pt,.2pt" o:gfxdata="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" strokecolor="#272727 [2749]">
                       <v:stroke dashstyle="dash"/>
                     </v:line>
                   </w:pict>
@@ -2680,6 +2682,8 @@
                 </w:tcPr>
                 <w:p>
                   <w:pPr>
+                    <w:keepNext/>
+                    <w:keepLines/>
                     <w:spacing w:before="60" w:after="60"/>
                     <w:jc w:val="center"/>
                     <w:rPr>
@@ -2718,6 +2722,8 @@
                 </w:tcPr>
                 <w:p>
                   <w:pPr>
+                    <w:keepNext/>
+                    <w:keepLines/>
                     <w:spacing w:before="60" w:after="60"/>
                     <w:jc w:val="center"/>
                     <w:rPr>
@@ -2760,6 +2766,8 @@
                 </w:tcPr>
                 <w:p>
                   <w:pPr>
+                    <w:keepNext/>
+                    <w:keepLines/>
                     <w:spacing w:before="60" w:after="60"/>
                     <w:jc w:val="center"/>
                     <w:rPr>
@@ -2795,6 +2803,8 @@
                 </w:tcPr>
                 <w:p>
                   <w:pPr>
+                    <w:keepNext/>
+                    <w:keepLines/>
                     <w:spacing w:before="60" w:after="60"/>
                     <w:jc w:val="center"/>
                     <w:rPr>
@@ -2814,7 +2824,12 @@
               </w:tc>
             </w:tr>
           </w:tbl>
-          <w:p/>
+          <w:p>
+            <w:pPr>
+              <w:keepNext/>
+              <w:keepLines/>
+            </w:pPr>
+          </w:p>
         </w:tc>
         <w:tc>
           <w:tcPr>
@@ -2826,13 +2841,23 @@
               <w:right w:w="0" w:type="dxa"/>
             </w:tcMar>
           </w:tcPr>
-          <w:p/>
+          <w:p>
+            <w:pPr>
+              <w:keepNext/>
+              <w:keepLines/>
+            </w:pPr>
+          </w:p>
         </w:tc>
         <w:tc>
           <w:tcPr>
             <w:tcW w:w="5302" w:type="dxa"/>
           </w:tcPr>
-          <w:p/>
+          <w:p>
+            <w:pPr>
+              <w:keepNext/>
+              <w:keepLines/>
+            </w:pPr>
+          </w:p>
           <w:tbl>
             <w:tblPr>
               <w:tblW w:w="4487" w:type="dxa"/>
@@ -2863,6 +2888,8 @@
                 </w:tcPr>
                 <w:p>
                   <w:pPr>
+                    <w:keepNext/>
+                    <w:keepLines/>
                     <w:spacing w:line="276" w:lineRule="auto"/>
                     <w:rPr>
                       <w:sz w:val="18"/>
@@ -2902,6 +2929,8 @@
                 </w:tcPr>
                 <w:p>
                   <w:pPr>
+                    <w:keepNext/>
+                    <w:keepLines/>
                     <w:spacing w:line="276" w:lineRule="auto"/>
                     <w:rPr>
                       <w:sz w:val="18"/>
@@ -2931,6 +2960,8 @@
                 </w:tcPr>
                 <w:p>
                   <w:pPr>
+                    <w:keepNext/>
+                    <w:keepLines/>
                     <w:spacing w:line="276" w:lineRule="auto"/>
                     <w:jc w:val="right"/>
                     <w:rPr>
@@ -2967,6 +2998,8 @@
                 </w:tcPr>
                 <w:p>
                   <w:pPr>
+                    <w:keepNext/>
+                    <w:keepLines/>
                     <w:spacing w:line="276" w:lineRule="auto"/>
                     <w:rPr>
                       <w:sz w:val="18"/>
@@ -3006,6 +3039,8 @@
                 </w:tcPr>
                 <w:p>
                   <w:pPr>
+                    <w:keepNext/>
+                    <w:keepLines/>
                     <w:spacing w:line="276" w:lineRule="auto"/>
                     <w:rPr>
                       <w:sz w:val="18"/>
@@ -3035,6 +3070,8 @@
                 </w:tcPr>
                 <w:p>
                   <w:pPr>
+                    <w:keepNext/>
+                    <w:keepLines/>
                     <w:spacing w:line="276" w:lineRule="auto"/>
                     <w:jc w:val="right"/>
                     <w:rPr>
@@ -3071,6 +3108,8 @@
                 </w:tcPr>
                 <w:p>
                   <w:pPr>
+                    <w:keepNext/>
+                    <w:keepLines/>
                     <w:spacing w:line="276" w:lineRule="auto"/>
                     <w:rPr>
                       <w:color w:val="000000"/>
@@ -3101,6 +3140,8 @@
                 </w:tcPr>
                 <w:p>
                   <w:pPr>
+                    <w:keepNext/>
+                    <w:keepLines/>
                     <w:spacing w:line="276" w:lineRule="auto"/>
                     <w:rPr>
                       <w:color w:val="000000"/>
@@ -3131,6 +3172,8 @@
                 </w:tcPr>
                 <w:p>
                   <w:pPr>
+                    <w:keepNext/>
+                    <w:keepLines/>
                     <w:spacing w:line="276" w:lineRule="auto"/>
                     <w:jc w:val="right"/>
                     <w:rPr>
@@ -3168,6 +3211,8 @@
                 </w:tcPr>
                 <w:p>
                   <w:pPr>
+                    <w:keepNext/>
+                    <w:keepLines/>
                     <w:spacing w:line="276" w:lineRule="auto"/>
                     <w:rPr>
                       <w:sz w:val="18"/>
@@ -3207,6 +3252,8 @@
                 </w:tcPr>
                 <w:p>
                   <w:pPr>
+                    <w:keepNext/>
+                    <w:keepLines/>
                     <w:spacing w:line="276" w:lineRule="auto"/>
                     <w:rPr>
                       <w:sz w:val="18"/>
@@ -3236,6 +3283,8 @@
                 </w:tcPr>
                 <w:p>
                   <w:pPr>
+                    <w:keepNext/>
+                    <w:keepLines/>
                     <w:spacing w:line="276" w:lineRule="auto"/>
                     <w:jc w:val="right"/>
                     <w:rPr>
@@ -3272,6 +3321,8 @@
                 </w:tcPr>
                 <w:p>
                   <w:pPr>
+                    <w:keepNext/>
+                    <w:keepLines/>
                     <w:spacing w:line="276" w:lineRule="auto"/>
                     <w:rPr>
                       <w:sz w:val="18"/>
@@ -3301,6 +3352,8 @@
                 </w:tcPr>
                 <w:p>
                   <w:pPr>
+                    <w:keepNext/>
+                    <w:keepLines/>
                     <w:spacing w:line="276" w:lineRule="auto"/>
                     <w:rPr>
                       <w:sz w:val="18"/>
@@ -3330,6 +3383,8 @@
                 </w:tcPr>
                 <w:p>
                   <w:pPr>
+                    <w:keepNext/>
+                    <w:keepLines/>
                     <w:spacing w:line="276" w:lineRule="auto"/>
                     <w:jc w:val="right"/>
                     <w:rPr>
@@ -3366,6 +3421,8 @@
                 </w:tcPr>
                 <w:p>
                   <w:pPr>
+                    <w:keepNext/>
+                    <w:keepLines/>
                     <w:spacing w:line="360" w:lineRule="auto"/>
                     <w:rPr>
                       <w:sz w:val="18"/>
@@ -3397,6 +3454,8 @@
                 </w:tcPr>
                 <w:p>
                   <w:pPr>
+                    <w:keepNext/>
+                    <w:keepLines/>
                     <w:spacing w:line="360" w:lineRule="auto"/>
                     <w:rPr>
                       <w:sz w:val="18"/>
@@ -3426,6 +3485,8 @@
                 </w:tcPr>
                 <w:p>
                   <w:pPr>
+                    <w:keepNext/>
+                    <w:keepLines/>
                     <w:spacing w:line="360" w:lineRule="auto"/>
                     <w:jc w:val="right"/>
                     <w:rPr>
@@ -3462,6 +3523,8 @@
                 </w:tcPr>
                 <w:p>
                   <w:pPr>
+                    <w:keepNext/>
+                    <w:keepLines/>
                     <w:spacing w:line="276" w:lineRule="auto"/>
                     <w:rPr>
                       <w:bCs/>
@@ -3544,7 +3607,7 @@
                       </mc:Choice>
                       <mc:Fallback>
                         <w:pict>
-                          <v:line w14:anchorId="5A15E99D" id="Straight Connector 5" o:spid="_x0000_s1026" style="position:absolute;z-index:251684864;visibility:visible;mso-wrap-style:square;mso-width-percent:0;mso-height-percent:0;mso-wrap-distance-left:9pt;mso-wrap-distance-top:0;mso-wrap-distance-right:9pt;mso-wrap-distance-bottom:0;mso-position-horizontal:absolute;mso-position-horizontal-relative:text;mso-position-vertical:absolute;mso-position-vertical-relative:text;mso-width-percent:0;mso-height-percent:0;mso-width-relative:margin;mso-height-relative:margin" from="-.15pt,-2.55pt" to="224pt,-2.55pt" o:gfxdata="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" strokecolor="#272727 [2749]">
+                          <v:line w14:anchorId="424059C3" id="Straight Connector 5" o:spid="_x0000_s1026" style="position:absolute;z-index:251684864;visibility:visible;mso-wrap-style:square;mso-width-percent:0;mso-height-percent:0;mso-wrap-distance-left:9pt;mso-wrap-distance-top:0;mso-wrap-distance-right:9pt;mso-wrap-distance-bottom:0;mso-position-horizontal:absolute;mso-position-horizontal-relative:text;mso-position-vertical:absolute;mso-position-vertical-relative:text;mso-width-percent:0;mso-height-percent:0;mso-width-relative:margin;mso-height-relative:margin" from="-.15pt,-2.55pt" to="224pt,-2.55pt" o:gfxdata="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" strokecolor="#272727 [2749]">
                             <v:stroke dashstyle="dash"/>
                           </v:line>
                         </w:pict>
@@ -3586,6 +3649,8 @@
                 </w:tcPr>
                 <w:p>
                   <w:pPr>
+                    <w:keepNext/>
+                    <w:keepLines/>
                     <w:spacing w:line="276" w:lineRule="auto"/>
                     <w:rPr>
                       <w:bCs/>
@@ -3618,6 +3683,8 @@
                 </w:tcPr>
                 <w:p>
                   <w:pPr>
+                    <w:keepNext/>
+                    <w:keepLines/>
                     <w:spacing w:line="276" w:lineRule="auto"/>
                     <w:jc w:val="right"/>
                     <w:rPr>
@@ -3657,6 +3724,8 @@
                 </w:tcPr>
                 <w:p>
                   <w:pPr>
+                    <w:keepNext/>
+                    <w:keepLines/>
                     <w:spacing w:line="360" w:lineRule="auto"/>
                     <w:rPr>
                       <w:bCs/>
@@ -3739,7 +3808,7 @@
                       </mc:Choice>
                       <mc:Fallback>
                         <w:pict>
-                          <v:line w14:anchorId="718D7785" id="Straight Connector 6" o:spid="_x0000_s1026" style="position:absolute;z-index:251695104;visibility:visible;mso-wrap-style:square;mso-width-percent:0;mso-height-percent:0;mso-wrap-distance-left:9pt;mso-wrap-distance-top:0;mso-wrap-distance-right:9pt;mso-wrap-distance-bottom:0;mso-position-horizontal:absolute;mso-position-horizontal-relative:text;mso-position-vertical:absolute;mso-position-vertical-relative:text;mso-width-percent:0;mso-height-percent:0;mso-width-relative:margin;mso-height-relative:margin" from="-.25pt,13.45pt" to="223.9pt,13.45pt" o:gfxdata="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" strokecolor="#272727 [2749]">
+                          <v:line w14:anchorId="066520F9" id="Straight Connector 6" o:spid="_x0000_s1026" style="position:absolute;z-index:251695104;visibility:visible;mso-wrap-style:square;mso-width-percent:0;mso-height-percent:0;mso-wrap-distance-left:9pt;mso-wrap-distance-top:0;mso-wrap-distance-right:9pt;mso-wrap-distance-bottom:0;mso-position-horizontal:absolute;mso-position-horizontal-relative:text;mso-position-vertical:absolute;mso-position-vertical-relative:text;mso-width-percent:0;mso-height-percent:0;mso-width-relative:margin;mso-height-relative:margin" from="-.25pt,13.45pt" to="223.9pt,13.45pt" o:gfxdata="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" strokecolor="#272727 [2749]">
                             <v:stroke dashstyle="dash"/>
                           </v:line>
                         </w:pict>
@@ -3770,6 +3839,8 @@
                 </w:tcPr>
                 <w:p>
                   <w:pPr>
+                    <w:keepNext/>
+                    <w:keepLines/>
                     <w:spacing w:line="360" w:lineRule="auto"/>
                     <w:rPr>
                       <w:bCs/>
@@ -3802,6 +3873,8 @@
                 </w:tcPr>
                 <w:p>
                   <w:pPr>
+                    <w:keepNext/>
+                    <w:keepLines/>
                     <w:spacing w:line="360" w:lineRule="auto"/>
                     <w:jc w:val="right"/>
                     <w:rPr>
@@ -3841,6 +3914,8 @@
                 </w:tcPr>
                 <w:p>
                   <w:pPr>
+                    <w:keepNext/>
+                    <w:keepLines/>
                     <w:spacing w:line="276" w:lineRule="auto"/>
                     <w:rPr>
                       <w:bCs/>
@@ -3894,6 +3969,8 @@
                 </w:tcPr>
                 <w:p>
                   <w:pPr>
+                    <w:keepNext/>
+                    <w:keepLines/>
                     <w:spacing w:line="276" w:lineRule="auto"/>
                     <w:rPr>
                       <w:bCs/>
@@ -3925,6 +4002,8 @@
                 </w:tcPr>
                 <w:p>
                   <w:pPr>
+                    <w:keepNext/>
+                    <w:keepLines/>
                     <w:spacing w:line="276" w:lineRule="auto"/>
                     <w:jc w:val="right"/>
                     <w:rPr>
@@ -3946,12 +4025,19 @@
               </w:tc>
             </w:tr>
           </w:tbl>
-          <w:p/>
+          <w:p>
+            <w:pPr>
+              <w:keepNext/>
+              <w:keepLines/>
+            </w:pPr>
+          </w:p>
         </w:tc>
       </w:tr>
     </w:tbl>
     <w:p>
       <w:pPr>
+        <w:keepNext/>
+        <w:keepLines/>
         <w:spacing w:before="80" w:after="20"/>
         <w:jc w:val="right"/>
         <w:rPr>
@@ -3961,6 +4047,8 @@
     </w:p>
     <w:p>
       <w:pPr>
+        <w:keepNext/>
+        <w:keepLines/>
         <w:spacing w:before="80" w:after="20" w:line="360" w:lineRule="auto"/>
         <w:ind w:left="5670"/>
         <w:jc w:val="center"/>
@@ -4015,6 +4103,8 @@
           </w:tcPr>
           <w:p>
             <w:pPr>
+              <w:keepNext/>
+              <w:keepLines/>
               <w:jc w:val="center"/>
               <w:rPr>
                 <w:sz w:val="18"/>
@@ -4036,6 +4126,8 @@
           </w:tcPr>
           <w:p>
             <w:pPr>
+              <w:keepNext/>
+              <w:keepLines/>
               <w:jc w:val="center"/>
               <w:rPr>
                 <w:sz w:val="18"/>
@@ -4091,6 +4183,8 @@
           </w:tcPr>
           <w:p>
             <w:pPr>
+              <w:keepNext/>
+              <w:keepLines/>
               <w:jc w:val="center"/>
               <w:rPr>
                 <w:sz w:val="18"/>
@@ -4112,6 +4206,8 @@
           </w:tcPr>
           <w:p>
             <w:pPr>
+              <w:keepNext/>
+              <w:keepLines/>
               <w:jc w:val="center"/>
               <w:rPr>
                 <w:sz w:val="18"/>
@@ -4163,6 +4259,8 @@
           </w:tcPr>
           <w:p>
             <w:pPr>
+              <w:keepNext/>
+              <w:keepLines/>
               <w:jc w:val="center"/>
               <w:rPr>
                 <w:sz w:val="18"/>
@@ -4184,6 +4282,8 @@
           </w:tcPr>
           <w:p>
             <w:pPr>
+              <w:keepNext/>
+              <w:keepLines/>
               <w:jc w:val="center"/>
               <w:rPr>
                 <w:sz w:val="18"/>
@@ -4205,8 +4305,8 @@
     <w:p/>
     <w:sectPr>
       <w:footerReference w:type="default" r:id="rId9"/>
-      <w:pgSz w:w="12240" w:h="15840"/>
-      <w:pgMar w:top="288" w:right="475" w:bottom="317" w:left="475" w:header="72" w:footer="173" w:gutter="0"/>
+      <w:pgSz w:w="12242" w:h="18722" w:code="14"/>
+      <w:pgMar w:top="289" w:right="476" w:bottom="318" w:left="476" w:header="74" w:footer="176" w:gutter="0"/>
       <w:cols w:space="720"/>
       <w:docGrid w:linePitch="360"/>
     </w:sectPr>

</xml_diff>

<commit_message>
fix docx billing 2
</commit_message>
<xml_diff>
--- a/public/doc/klaim/billing/cetakBerkasBilling.docx
+++ b/public/doc/klaim/billing/cetakBerkasBilling.docx
@@ -463,7 +463,7 @@
                 </mc:Choice>
                 <mc:Fallback>
                   <w:pict>
-                    <v:line w14:anchorId="4AC1B28F" id="Straight Connector 2" o:spid="_x0000_s1026" style="position:absolute;z-index:251645952;visibility:visible;mso-wrap-style:square;mso-width-percent:0;mso-height-percent:0;mso-wrap-distance-left:9pt;mso-wrap-distance-top:0;mso-wrap-distance-right:9pt;mso-wrap-distance-bottom:0;mso-position-horizontal:absolute;mso-position-horizontal-relative:text;mso-position-vertical:absolute;mso-position-vertical-relative:text;mso-width-percent:0;mso-height-percent:0;mso-width-relative:margin;mso-height-relative:margin" from=".1pt,.2pt" to="557.95pt,.2pt" o:gfxdata="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" strokecolor="#272727 [2749]">
+                    <v:line w14:anchorId="0162FB2D" id="Straight Connector 2" o:spid="_x0000_s1026" style="position:absolute;z-index:251645952;visibility:visible;mso-wrap-style:square;mso-width-percent:0;mso-height-percent:0;mso-wrap-distance-left:9pt;mso-wrap-distance-top:0;mso-wrap-distance-right:9pt;mso-wrap-distance-bottom:0;mso-position-horizontal:absolute;mso-position-horizontal-relative:text;mso-position-vertical:absolute;mso-position-vertical-relative:text;mso-width-percent:0;mso-height-percent:0;mso-width-relative:margin;mso-height-relative:margin" from=".1pt,.2pt" to="557.95pt,.2pt" o:gfxdata="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" strokecolor="#272727 [2749]">
                       <v:stroke dashstyle="dash"/>
                     </v:line>
                   </w:pict>
@@ -1441,7 +1441,7 @@
                       </mc:Choice>
                       <mc:Fallback>
                         <w:pict>
-                          <v:line w14:anchorId="0313AFC2" id="Straight Connector 5" o:spid="_x0000_s1026" style="position:absolute;z-index:251684864;visibility:visible;mso-wrap-style:square;mso-width-percent:0;mso-height-percent:0;mso-wrap-distance-left:9pt;mso-wrap-distance-top:0;mso-wrap-distance-right:9pt;mso-wrap-distance-bottom:0;mso-position-horizontal:absolute;mso-position-horizontal-relative:text;mso-position-vertical:absolute;mso-position-vertical-relative:text;mso-width-percent:0;mso-height-percent:0;mso-width-relative:margin;mso-height-relative:margin" from="-.15pt,-2.55pt" to="224pt,-2.55pt" o:gfxdata="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" strokecolor="#272727 [2749]">
+                          <v:line w14:anchorId="17B99DC3" id="Straight Connector 5" o:spid="_x0000_s1026" style="position:absolute;z-index:251684864;visibility:visible;mso-wrap-style:square;mso-width-percent:0;mso-height-percent:0;mso-wrap-distance-left:9pt;mso-wrap-distance-top:0;mso-wrap-distance-right:9pt;mso-wrap-distance-bottom:0;mso-position-horizontal:absolute;mso-position-horizontal-relative:text;mso-position-vertical:absolute;mso-position-vertical-relative:text;mso-width-percent:0;mso-height-percent:0;mso-width-relative:margin;mso-height-relative:margin" from="-.15pt,-2.55pt" to="224pt,-2.55pt" o:gfxdata="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" strokecolor="#272727 [2749]">
                             <v:stroke dashstyle="dash"/>
                           </v:line>
                         </w:pict>
@@ -1642,7 +1642,7 @@
                       </mc:Choice>
                       <mc:Fallback>
                         <w:pict>
-                          <v:line w14:anchorId="57558F25" id="Straight Connector 6" o:spid="_x0000_s1026" style="position:absolute;z-index:251695104;visibility:visible;mso-wrap-style:square;mso-width-percent:0;mso-height-percent:0;mso-wrap-distance-left:9pt;mso-wrap-distance-top:0;mso-wrap-distance-right:9pt;mso-wrap-distance-bottom:0;mso-position-horizontal:absolute;mso-position-horizontal-relative:text;mso-position-vertical:absolute;mso-position-vertical-relative:text;mso-width-percent:0;mso-height-percent:0;mso-width-relative:margin;mso-height-relative:margin" from="-.25pt,13.45pt" to="223.9pt,13.45pt" o:gfxdata="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" strokecolor="#272727 [2749]">
+                          <v:line w14:anchorId="654CB031" id="Straight Connector 6" o:spid="_x0000_s1026" style="position:absolute;z-index:251695104;visibility:visible;mso-wrap-style:square;mso-width-percent:0;mso-height-percent:0;mso-wrap-distance-left:9pt;mso-wrap-distance-top:0;mso-wrap-distance-right:9pt;mso-wrap-distance-bottom:0;mso-position-horizontal:absolute;mso-position-horizontal-relative:text;mso-position-vertical:absolute;mso-position-vertical-relative:text;mso-width-percent:0;mso-height-percent:0;mso-width-relative:margin;mso-height-relative:margin" from="-.25pt,13.45pt" to="223.9pt,13.45pt" o:gfxdata="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" strokecolor="#272727 [2749]">
                             <v:stroke dashstyle="dash"/>
                           </v:line>
                         </w:pict>
@@ -1893,98 +1893,6 @@
       </w:pPr>
       <w:r>
         <w:rPr>
-          <w:rFonts w:cstheme="minorHAnsi"/>
-          <w:noProof/>
-        </w:rPr>
-        <mc:AlternateContent>
-          <mc:Choice Requires="wps">
-            <w:drawing>
-              <wp:anchor distT="0" distB="0" distL="114300" distR="114300" simplePos="0" relativeHeight="251662848" behindDoc="0" locked="0" layoutInCell="1" allowOverlap="1" wp14:anchorId="15A823F0" wp14:editId="142263AE">
-                <wp:simplePos x="0" y="0"/>
-                <wp:positionH relativeFrom="column">
-                  <wp:posOffset>3993515</wp:posOffset>
-                </wp:positionH>
-                <wp:positionV relativeFrom="paragraph">
-                  <wp:posOffset>159385</wp:posOffset>
-                </wp:positionV>
-                <wp:extent cx="2752725" cy="1343519"/>
-                <wp:effectExtent l="0" t="0" r="0" b="0"/>
-                <wp:wrapNone/>
-                <wp:docPr id="7" name="Text Box 7"/>
-                <wp:cNvGraphicFramePr/>
-                <a:graphic xmlns:a="http://schemas.openxmlformats.org/drawingml/2006/main">
-                  <a:graphicData uri="http://schemas.microsoft.com/office/word/2010/wordprocessingShape">
-                    <wps:wsp>
-                      <wps:cNvSpPr txBox="1"/>
-                      <wps:spPr>
-                        <a:xfrm>
-                          <a:off x="0" y="0"/>
-                          <a:ext cx="2752725" cy="1343519"/>
-                        </a:xfrm>
-                        <a:prstGeom prst="rect">
-                          <a:avLst/>
-                        </a:prstGeom>
-                        <a:noFill/>
-                        <a:ln w="6350">
-                          <a:noFill/>
-                        </a:ln>
-                      </wps:spPr>
-                      <wps:txbx>
-                        <w:txbxContent>
-                          <w:p>
-                            <w:pPr>
-                              <w:jc w:val="center"/>
-                            </w:pPr>
-                            <w:r>
-                              <w:t>${TTD_PETUGAS}</w:t>
-                            </w:r>
-                          </w:p>
-                        </w:txbxContent>
-                      </wps:txbx>
-                      <wps:bodyPr rot="0" spcFirstLastPara="0" vertOverflow="overflow" horzOverflow="overflow" vert="horz" wrap="square" lIns="91440" tIns="45720" rIns="91440" bIns="45720" numCol="1" spcCol="0" rtlCol="0" fromWordArt="0" anchor="ctr" anchorCtr="0" forceAA="0" compatLnSpc="1">
-                        <a:prstTxWarp prst="textNoShape">
-                          <a:avLst/>
-                        </a:prstTxWarp>
-                        <a:noAutofit/>
-                      </wps:bodyPr>
-                    </wps:wsp>
-                  </a:graphicData>
-                </a:graphic>
-                <wp14:sizeRelH relativeFrom="margin">
-                  <wp14:pctWidth>0</wp14:pctWidth>
-                </wp14:sizeRelH>
-                <wp14:sizeRelV relativeFrom="margin">
-                  <wp14:pctHeight>0</wp14:pctHeight>
-                </wp14:sizeRelV>
-              </wp:anchor>
-            </w:drawing>
-          </mc:Choice>
-          <mc:Fallback>
-            <w:pict>
-              <v:shapetype w14:anchorId="15A823F0" id="_x0000_t202" coordsize="21600,21600" o:spt="202" path="m,l,21600r21600,l21600,xe">
-                <v:stroke joinstyle="miter"/>
-                <v:path gradientshapeok="t" o:connecttype="rect"/>
-              </v:shapetype>
-              <v:shape id="Text Box 7" o:spid="_x0000_s1026" type="#_x0000_t202" style="position:absolute;left:0;text-align:left;margin-left:314.45pt;margin-top:12.55pt;width:216.75pt;height:105.8pt;z-index:251662848;visibility:visible;mso-wrap-style:square;mso-width-percent:0;mso-height-percent:0;mso-wrap-distance-left:9pt;mso-wrap-distance-top:0;mso-wrap-distance-right:9pt;mso-wrap-distance-bottom:0;mso-position-horizontal:absolute;mso-position-horizontal-relative:text;mso-position-vertical:absolute;mso-position-vertical-relative:text;mso-width-percent:0;mso-height-percent:0;mso-width-relative:margin;mso-height-relative:margin;v-text-anchor:middle" o:gfxdata="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" filled="f" stroked="f" strokeweight=".5pt">
-                <v:textbox>
-                  <w:txbxContent>
-                    <w:p>
-                      <w:pPr>
-                        <w:jc w:val="center"/>
-                      </w:pPr>
-                      <w:r>
-                        <w:t>${TTD_PETUGAS}</w:t>
-                      </w:r>
-                    </w:p>
-                  </w:txbxContent>
-                </v:textbox>
-              </v:shape>
-            </w:pict>
-          </mc:Fallback>
-        </mc:AlternateContent>
-      </w:r>
-      <w:r>
-        <w:rPr>
           <w:color w:val="000000"/>
           <w:sz w:val="18"/>
           <w:szCs w:val="18"/>
@@ -2060,6 +1968,98 @@
                 <w:szCs w:val="18"/>
               </w:rPr>
             </w:pPr>
+            <w:r>
+              <w:rPr>
+                <w:rFonts w:cstheme="minorHAnsi"/>
+                <w:noProof/>
+              </w:rPr>
+              <mc:AlternateContent>
+                <mc:Choice Requires="wps">
+                  <w:drawing>
+                    <wp:anchor distT="0" distB="0" distL="114300" distR="114300" simplePos="0" relativeHeight="251658752" behindDoc="0" locked="0" layoutInCell="1" allowOverlap="1" wp14:anchorId="15A823F0" wp14:editId="518CD3B9">
+                      <wp:simplePos x="0" y="0"/>
+                      <wp:positionH relativeFrom="column">
+                        <wp:posOffset>767715</wp:posOffset>
+                      </wp:positionH>
+                      <wp:positionV relativeFrom="paragraph">
+                        <wp:posOffset>76835</wp:posOffset>
+                      </wp:positionV>
+                      <wp:extent cx="2127250" cy="1038225"/>
+                      <wp:effectExtent l="0" t="0" r="0" b="0"/>
+                      <wp:wrapNone/>
+                      <wp:docPr id="7" name="Text Box 7"/>
+                      <wp:cNvGraphicFramePr/>
+                      <a:graphic xmlns:a="http://schemas.openxmlformats.org/drawingml/2006/main">
+                        <a:graphicData uri="http://schemas.microsoft.com/office/word/2010/wordprocessingShape">
+                          <wps:wsp>
+                            <wps:cNvSpPr txBox="1"/>
+                            <wps:spPr>
+                              <a:xfrm>
+                                <a:off x="0" y="0"/>
+                                <a:ext cx="2127250" cy="1038225"/>
+                              </a:xfrm>
+                              <a:prstGeom prst="rect">
+                                <a:avLst/>
+                              </a:prstGeom>
+                              <a:noFill/>
+                              <a:ln w="6350">
+                                <a:noFill/>
+                              </a:ln>
+                            </wps:spPr>
+                            <wps:txbx>
+                              <w:txbxContent>
+                                <w:p>
+                                  <w:pPr>
+                                    <w:jc w:val="center"/>
+                                  </w:pPr>
+                                  <w:r>
+                                    <w:t>${TTD_PETUGAS}</w:t>
+                                  </w:r>
+                                </w:p>
+                              </w:txbxContent>
+                            </wps:txbx>
+                            <wps:bodyPr rot="0" spcFirstLastPara="0" vertOverflow="overflow" horzOverflow="overflow" vert="horz" wrap="square" lIns="91440" tIns="45720" rIns="91440" bIns="45720" numCol="1" spcCol="0" rtlCol="0" fromWordArt="0" anchor="ctr" anchorCtr="0" forceAA="0" compatLnSpc="1">
+                              <a:prstTxWarp prst="textNoShape">
+                                <a:avLst/>
+                              </a:prstTxWarp>
+                              <a:noAutofit/>
+                            </wps:bodyPr>
+                          </wps:wsp>
+                        </a:graphicData>
+                      </a:graphic>
+                      <wp14:sizeRelH relativeFrom="margin">
+                        <wp14:pctWidth>0</wp14:pctWidth>
+                      </wp14:sizeRelH>
+                      <wp14:sizeRelV relativeFrom="margin">
+                        <wp14:pctHeight>0</wp14:pctHeight>
+                      </wp14:sizeRelV>
+                    </wp:anchor>
+                  </w:drawing>
+                </mc:Choice>
+                <mc:Fallback>
+                  <w:pict>
+                    <v:shapetype w14:anchorId="15A823F0" id="_x0000_t202" coordsize="21600,21600" o:spt="202" path="m,l,21600r21600,l21600,xe">
+                      <v:stroke joinstyle="miter"/>
+                      <v:path gradientshapeok="t" o:connecttype="rect"/>
+                    </v:shapetype>
+                    <v:shape id="Text Box 7" o:spid="_x0000_s1026" type="#_x0000_t202" style="position:absolute;left:0;text-align:left;margin-left:60.45pt;margin-top:6.05pt;width:167.5pt;height:81.75pt;z-index:251658752;visibility:visible;mso-wrap-style:square;mso-width-percent:0;mso-height-percent:0;mso-wrap-distance-left:9pt;mso-wrap-distance-top:0;mso-wrap-distance-right:9pt;mso-wrap-distance-bottom:0;mso-position-horizontal:absolute;mso-position-horizontal-relative:text;mso-position-vertical:absolute;mso-position-vertical-relative:text;mso-width-percent:0;mso-height-percent:0;mso-width-relative:margin;mso-height-relative:margin;v-text-anchor:middle" o:gfxdata="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" filled="f" stroked="f" strokeweight=".5pt">
+                      <v:textbox>
+                        <w:txbxContent>
+                          <w:p>
+                            <w:pPr>
+                              <w:jc w:val="center"/>
+                            </w:pPr>
+                            <w:r>
+                              <w:t>${TTD_PETUGAS}</w:t>
+                            </w:r>
+                          </w:p>
+                        </w:txbxContent>
+                      </v:textbox>
+                    </v:shape>
+                  </w:pict>
+                </mc:Fallback>
+              </mc:AlternateContent>
+            </w:r>
             <w:proofErr w:type="spellStart"/>
             <w:r>
               <w:rPr>
@@ -4206,7 +4206,7 @@
               </mc:Choice>
               <mc:Fallback>
                 <w:pict>
-                  <v:line w14:anchorId="2F1BF360" id="Straight Connector 4" o:spid="_x0000_s1026" style="position:absolute;z-index:251664896;visibility:visible;mso-wrap-style:square;mso-width-percent:0;mso-height-percent:0;mso-wrap-distance-left:9pt;mso-wrap-distance-top:0;mso-wrap-distance-right:9pt;mso-wrap-distance-bottom:0;mso-position-horizontal:absolute;mso-position-horizontal-relative:text;mso-position-vertical:absolute;mso-position-vertical-relative:text;mso-width-percent:0;mso-height-percent:0;mso-width-relative:margin;mso-height-relative:margin" from="-1.1pt,-.7pt" to="556.75pt,-.7pt" o:gfxdata="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" strokecolor="#272727 [2749]">
+                  <v:line w14:anchorId="234CAD7E" id="Straight Connector 4" o:spid="_x0000_s1026" style="position:absolute;z-index:251664896;visibility:visible;mso-wrap-style:square;mso-width-percent:0;mso-height-percent:0;mso-wrap-distance-left:9pt;mso-wrap-distance-top:0;mso-wrap-distance-right:9pt;mso-wrap-distance-bottom:0;mso-position-horizontal:absolute;mso-position-horizontal-relative:text;mso-position-vertical:absolute;mso-position-vertical-relative:text;mso-width-percent:0;mso-height-percent:0;mso-width-relative:margin;mso-height-relative:margin" from="-1.1pt,-.7pt" to="556.75pt,-.7pt" o:gfxdata="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" strokecolor="#272727 [2749]">
                     <v:stroke dashstyle="dash"/>
                   </v:line>
                 </w:pict>
@@ -4287,7 +4287,7 @@
               </mc:Choice>
               <mc:Fallback>
                 <w:pict>
-                  <v:line w14:anchorId="546A5707" id="Straight Connector 3" o:spid="_x0000_s1026" style="position:absolute;z-index:251659776;visibility:visible;mso-wrap-style:square;mso-width-percent:0;mso-height-percent:0;mso-wrap-distance-left:9pt;mso-wrap-distance-top:0;mso-wrap-distance-right:9pt;mso-wrap-distance-bottom:0;mso-position-horizontal:absolute;mso-position-horizontal-relative:text;mso-position-vertical:absolute;mso-position-vertical-relative:text;mso-width-percent:0;mso-height-percent:0;mso-width-relative:margin;mso-height-relative:margin" from="-1.65pt,16.9pt" to="556.2pt,16.9pt" o:gfxdata="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" strokecolor="#272727 [2749]">
+                  <v:line w14:anchorId="27F375F3" id="Straight Connector 3" o:spid="_x0000_s1026" style="position:absolute;z-index:251659776;visibility:visible;mso-wrap-style:square;mso-width-percent:0;mso-height-percent:0;mso-wrap-distance-left:9pt;mso-wrap-distance-top:0;mso-wrap-distance-right:9pt;mso-wrap-distance-bottom:0;mso-position-horizontal:absolute;mso-position-horizontal-relative:text;mso-position-vertical:absolute;mso-position-vertical-relative:text;mso-width-percent:0;mso-height-percent:0;mso-width-relative:margin;mso-height-relative:margin" from="-1.65pt,16.9pt" to="556.2pt,16.9pt" o:gfxdata="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" strokecolor="#272727 [2749]">
                     <v:stroke dashstyle="dash"/>
                   </v:line>
                 </w:pict>

</xml_diff>

<commit_message>
docx billing final fix
</commit_message>
<xml_diff>
--- a/public/doc/klaim/billing/cetakBerkasBilling.docx
+++ b/public/doc/klaim/billing/cetakBerkasBilling.docx
@@ -463,7 +463,7 @@
                 </mc:Choice>
                 <mc:Fallback>
                   <w:pict>
-                    <v:line w14:anchorId="405999B3" id="Straight Connector 2" o:spid="_x0000_s1026" style="position:absolute;z-index:251645952;visibility:visible;mso-wrap-style:square;mso-width-percent:0;mso-height-percent:0;mso-wrap-distance-left:9pt;mso-wrap-distance-top:0;mso-wrap-distance-right:9pt;mso-wrap-distance-bottom:0;mso-position-horizontal:absolute;mso-position-horizontal-relative:text;mso-position-vertical:absolute;mso-position-vertical-relative:text;mso-width-percent:0;mso-height-percent:0;mso-width-relative:margin;mso-height-relative:margin" from=".1pt,.2pt" to="557.95pt,.2pt" o:gfxdata="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" strokecolor="#272727 [2749]">
+                    <v:line w14:anchorId="675E3E32" id="Straight Connector 2" o:spid="_x0000_s1026" style="position:absolute;z-index:251645952;visibility:visible;mso-wrap-style:square;mso-width-percent:0;mso-height-percent:0;mso-wrap-distance-left:9pt;mso-wrap-distance-top:0;mso-wrap-distance-right:9pt;mso-wrap-distance-bottom:0;mso-position-horizontal:absolute;mso-position-horizontal-relative:text;mso-position-vertical:absolute;mso-position-vertical-relative:text;mso-width-percent:0;mso-height-percent:0;mso-width-relative:margin;mso-height-relative:margin" from=".1pt,.2pt" to="557.95pt,.2pt" o:gfxdata="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" strokecolor="#272727 [2749]">
                       <v:stroke dashstyle="dash"/>
                     </v:line>
                   </w:pict>
@@ -1441,7 +1441,7 @@
                       </mc:Choice>
                       <mc:Fallback>
                         <w:pict>
-                          <v:line w14:anchorId="7DCE2C54" id="Straight Connector 5" o:spid="_x0000_s1026" style="position:absolute;z-index:251684864;visibility:visible;mso-wrap-style:square;mso-width-percent:0;mso-height-percent:0;mso-wrap-distance-left:9pt;mso-wrap-distance-top:0;mso-wrap-distance-right:9pt;mso-wrap-distance-bottom:0;mso-position-horizontal:absolute;mso-position-horizontal-relative:text;mso-position-vertical:absolute;mso-position-vertical-relative:text;mso-width-percent:0;mso-height-percent:0;mso-width-relative:margin;mso-height-relative:margin" from="-.15pt,-2.55pt" to="224pt,-2.55pt" o:gfxdata="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" strokecolor="#272727 [2749]">
+                          <v:line w14:anchorId="1E2FA5CE" id="Straight Connector 5" o:spid="_x0000_s1026" style="position:absolute;z-index:251684864;visibility:visible;mso-wrap-style:square;mso-width-percent:0;mso-height-percent:0;mso-wrap-distance-left:9pt;mso-wrap-distance-top:0;mso-wrap-distance-right:9pt;mso-wrap-distance-bottom:0;mso-position-horizontal:absolute;mso-position-horizontal-relative:text;mso-position-vertical:absolute;mso-position-vertical-relative:text;mso-width-percent:0;mso-height-percent:0;mso-width-relative:margin;mso-height-relative:margin" from="-.15pt,-2.55pt" to="224pt,-2.55pt" o:gfxdata="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" strokecolor="#272727 [2749]">
                             <v:stroke dashstyle="dash"/>
                           </v:line>
                         </w:pict>
@@ -1642,7 +1642,7 @@
                       </mc:Choice>
                       <mc:Fallback>
                         <w:pict>
-                          <v:line w14:anchorId="2DC1C15E" id="Straight Connector 6" o:spid="_x0000_s1026" style="position:absolute;z-index:251695104;visibility:visible;mso-wrap-style:square;mso-width-percent:0;mso-height-percent:0;mso-wrap-distance-left:9pt;mso-wrap-distance-top:0;mso-wrap-distance-right:9pt;mso-wrap-distance-bottom:0;mso-position-horizontal:absolute;mso-position-horizontal-relative:text;mso-position-vertical:absolute;mso-position-vertical-relative:text;mso-width-percent:0;mso-height-percent:0;mso-width-relative:margin;mso-height-relative:margin" from="-.25pt,13.45pt" to="223.9pt,13.45pt" o:gfxdata="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" strokecolor="#272727 [2749]">
+                          <v:line w14:anchorId="0157956D" id="Straight Connector 6" o:spid="_x0000_s1026" style="position:absolute;z-index:251695104;visibility:visible;mso-wrap-style:square;mso-width-percent:0;mso-height-percent:0;mso-wrap-distance-left:9pt;mso-wrap-distance-top:0;mso-wrap-distance-right:9pt;mso-wrap-distance-bottom:0;mso-position-horizontal:absolute;mso-position-horizontal-relative:text;mso-position-vertical:absolute;mso-position-vertical-relative:text;mso-width-percent:0;mso-height-percent:0;mso-width-relative:margin;mso-height-relative:margin" from="-.25pt,13.45pt" to="223.9pt,13.45pt" o:gfxdata="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" strokecolor="#272727 [2749]">
                             <v:stroke dashstyle="dash"/>
                           </v:line>
                         </w:pict>
@@ -1899,15 +1899,15 @@
         <mc:AlternateContent>
           <mc:Choice Requires="wps">
             <w:drawing>
-              <wp:anchor distT="0" distB="0" distL="114300" distR="114300" simplePos="0" relativeHeight="251658752" behindDoc="0" locked="0" layoutInCell="1" allowOverlap="1" wp14:anchorId="15A823F0" wp14:editId="761126BA">
+              <wp:anchor distT="0" distB="0" distL="114300" distR="114300" simplePos="0" relativeHeight="251658752" behindDoc="0" locked="0" layoutInCell="1" allowOverlap="1" wp14:anchorId="15A823F0" wp14:editId="4E8E91E5">
                 <wp:simplePos x="0" y="0"/>
                 <wp:positionH relativeFrom="column">
-                  <wp:posOffset>3993515</wp:posOffset>
+                  <wp:posOffset>4033520</wp:posOffset>
                 </wp:positionH>
                 <wp:positionV relativeFrom="paragraph">
-                  <wp:posOffset>179070</wp:posOffset>
+                  <wp:posOffset>207010</wp:posOffset>
                 </wp:positionV>
-                <wp:extent cx="2732248" cy="1333500"/>
+                <wp:extent cx="2634207" cy="1285875"/>
                 <wp:effectExtent l="0" t="0" r="0" b="0"/>
                 <wp:wrapNone/>
                 <wp:docPr id="7" name="Text Box 7"/>
@@ -1919,7 +1919,7 @@
                       <wps:spPr>
                         <a:xfrm>
                           <a:off x="0" y="0"/>
-                          <a:ext cx="2732248" cy="1333500"/>
+                          <a:ext cx="2634207" cy="1285875"/>
                         </a:xfrm>
                         <a:prstGeom prst="rect">
                           <a:avLst/>
@@ -1965,7 +1965,7 @@
                 <v:stroke joinstyle="miter"/>
                 <v:path gradientshapeok="t" o:connecttype="rect"/>
               </v:shapetype>
-              <v:shape id="Text Box 7" o:spid="_x0000_s1026" type="#_x0000_t202" style="position:absolute;left:0;text-align:left;margin-left:314.45pt;margin-top:14.1pt;width:215.15pt;height:105pt;z-index:251658752;visibility:visible;mso-wrap-style:square;mso-width-percent:0;mso-height-percent:0;mso-wrap-distance-left:9pt;mso-wrap-distance-top:0;mso-wrap-distance-right:9pt;mso-wrap-distance-bottom:0;mso-position-horizontal:absolute;mso-position-horizontal-relative:text;mso-position-vertical:absolute;mso-position-vertical-relative:text;mso-width-percent:0;mso-height-percent:0;mso-width-relative:margin;mso-height-relative:margin;v-text-anchor:middle" o:gfxdata="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" filled="f" stroked="f" strokeweight=".5pt">
+              <v:shape id="Text Box 7" o:spid="_x0000_s1026" type="#_x0000_t202" style="position:absolute;left:0;text-align:left;margin-left:317.6pt;margin-top:16.3pt;width:207.4pt;height:101.25pt;z-index:251658752;visibility:visible;mso-wrap-style:square;mso-width-percent:0;mso-height-percent:0;mso-wrap-distance-left:9pt;mso-wrap-distance-top:0;mso-wrap-distance-right:9pt;mso-wrap-distance-bottom:0;mso-position-horizontal:absolute;mso-position-horizontal-relative:text;mso-position-vertical:absolute;mso-position-vertical-relative:text;mso-width-percent:0;mso-height-percent:0;mso-width-relative:margin;mso-height-relative:margin;v-text-anchor:middle" o:gfxdata="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" filled="f" stroked="f" strokeweight=".5pt">
                 <v:textbox>
                   <w:txbxContent>
                     <w:p>
@@ -4206,7 +4206,7 @@
               </mc:Choice>
               <mc:Fallback>
                 <w:pict>
-                  <v:line w14:anchorId="6575F81B" id="Straight Connector 4" o:spid="_x0000_s1026" style="position:absolute;z-index:251664896;visibility:visible;mso-wrap-style:square;mso-width-percent:0;mso-height-percent:0;mso-wrap-distance-left:9pt;mso-wrap-distance-top:0;mso-wrap-distance-right:9pt;mso-wrap-distance-bottom:0;mso-position-horizontal:absolute;mso-position-horizontal-relative:text;mso-position-vertical:absolute;mso-position-vertical-relative:text;mso-width-percent:0;mso-height-percent:0;mso-width-relative:margin;mso-height-relative:margin" from="-1.1pt,-.7pt" to="556.75pt,-.7pt" o:gfxdata="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" strokecolor="#272727 [2749]">
+                  <v:line w14:anchorId="1D2486FB" id="Straight Connector 4" o:spid="_x0000_s1026" style="position:absolute;z-index:251664896;visibility:visible;mso-wrap-style:square;mso-width-percent:0;mso-height-percent:0;mso-wrap-distance-left:9pt;mso-wrap-distance-top:0;mso-wrap-distance-right:9pt;mso-wrap-distance-bottom:0;mso-position-horizontal:absolute;mso-position-horizontal-relative:text;mso-position-vertical:absolute;mso-position-vertical-relative:text;mso-width-percent:0;mso-height-percent:0;mso-width-relative:margin;mso-height-relative:margin" from="-1.1pt,-.7pt" to="556.75pt,-.7pt" o:gfxdata="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" strokecolor="#272727 [2749]">
                     <v:stroke dashstyle="dash"/>
                   </v:line>
                 </w:pict>
@@ -4287,7 +4287,7 @@
               </mc:Choice>
               <mc:Fallback>
                 <w:pict>
-                  <v:line w14:anchorId="5E349B82" id="Straight Connector 3" o:spid="_x0000_s1026" style="position:absolute;z-index:251659776;visibility:visible;mso-wrap-style:square;mso-width-percent:0;mso-height-percent:0;mso-wrap-distance-left:9pt;mso-wrap-distance-top:0;mso-wrap-distance-right:9pt;mso-wrap-distance-bottom:0;mso-position-horizontal:absolute;mso-position-horizontal-relative:text;mso-position-vertical:absolute;mso-position-vertical-relative:text;mso-width-percent:0;mso-height-percent:0;mso-width-relative:margin;mso-height-relative:margin" from="-1.65pt,16.9pt" to="556.2pt,16.9pt" o:gfxdata="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" strokecolor="#272727 [2749]">
+                  <v:line w14:anchorId="1709D423" id="Straight Connector 3" o:spid="_x0000_s1026" style="position:absolute;z-index:251659776;visibility:visible;mso-wrap-style:square;mso-width-percent:0;mso-height-percent:0;mso-wrap-distance-left:9pt;mso-wrap-distance-top:0;mso-wrap-distance-right:9pt;mso-wrap-distance-bottom:0;mso-position-horizontal:absolute;mso-position-horizontal-relative:text;mso-position-vertical:absolute;mso-position-vertical-relative:text;mso-width-percent:0;mso-height-percent:0;mso-width-relative:margin;mso-height-relative:margin" from="-1.65pt,16.9pt" to="556.2pt,16.9pt" o:gfxdata="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" strokecolor="#272727 [2749]">
                     <v:stroke dashstyle="dash"/>
                   </v:line>
                 </w:pict>

</xml_diff>